<commit_message>
Refactor thesis generator and styling
Large refactor of docs/thesis/generate_thesis.py to introduce a modular, KUL-compliant styling system and improve document generation. Added named styles, font/config helpers, TOC/field update helpers, code excerpt reader with line-range support, improved code/table/figure formatting, heading helpers, pagination/section handling and utilities to strip stale bookmarks. Also updated text/content in several chapter generators. Binary title page and output DOCX files were updated accordingly.
</commit_message>
<xml_diff>
--- a/docs/strona_tytulowa_128197 (1).docx
+++ b/docs/strona_tytulowa_128197 (1).docx
@@ -1,36 +1,30 @@
 
 <file path=word/document.xml><?xml version="1.0" encoding="utf-8"?>
-<w:document xmlns:ve="http://schemas.openxmlformats.org/markup-compatibility/2006" xmlns:o="urn:schemas-microsoft-com:office:office" xmlns:r="http://schemas.openxmlformats.org/officeDocument/2006/relationships" xmlns:m="http://schemas.openxmlformats.org/officeDocument/2006/math" xmlns:v="urn:schemas-microsoft-com:vml" xmlns:wp="http://schemas.openxmlformats.org/drawingml/2006/wordprocessingDrawing" xmlns:w10="urn:schemas-microsoft-com:office:word" xmlns:w="http://schemas.openxmlformats.org/wordprocessingml/2006/main" xmlns:wne="http://schemas.microsoft.com/office/word/2006/wordml">
+<w:document xmlns:w="http://schemas.openxmlformats.org/wordprocessingml/2006/main">
   <w:body>
     <w:p>
       <w:pPr>
-        <w:pStyle w:val="Heading1"/>
-      </w:pPr>
-      <w:bookmarkStart w:id="0" w:name="_Toc0"/>
+        <w:pStyle w:val="TitlePageHeading"/>
+      </w:pPr>
       <w:r>
         <w:t>Katolicki Uniwersytet Lubelski Jana Pawła II</w:t>
       </w:r>
-      <w:bookmarkEnd w:id="0"/>
-    </w:p>
-    <w:p>
-      <w:pPr>
-        <w:pStyle w:val="Heading1"/>
-      </w:pPr>
-      <w:bookmarkStart w:id="1" w:name="_Toc1"/>
+    </w:p>
+    <w:p>
+      <w:pPr>
+        <w:pStyle w:val="TitlePageHeading"/>
+      </w:pPr>
       <w:r>
         <w:t>Wydział Nauk Społecznych i Technicznych</w:t>
       </w:r>
-      <w:bookmarkEnd w:id="1"/>
-    </w:p>
-    <w:p>
-      <w:pPr>
-        <w:pStyle w:val="Heading1"/>
-      </w:pPr>
-      <w:bookmarkStart w:id="2" w:name="_Toc2"/>
+    </w:p>
+    <w:p>
+      <w:pPr>
+        <w:pStyle w:val="TitlePageHeading"/>
+      </w:pPr>
       <w:r>
         <w:t>Instytut Matematyki, Informatyki i Architektury Krajobrazu</w:t>
       </w:r>
-      <w:bookmarkEnd w:id="2"/>
     </w:p>
     <w:p>
       <w:pPr>
@@ -100,13 +94,11 @@
     </w:p>
     <w:p>
       <w:pPr>
-        <w:pStyle w:val="Heading1"/>
-      </w:pPr>
-      <w:bookmarkStart w:id="3" w:name="_Toc3"/>
+        <w:pStyle w:val="TitlePageHeading"/>
+      </w:pPr>
       <w:r>
         <w:t>Projekt i implementacja platformy do zarządzania usługą VPN</w:t>
       </w:r>
-      <w:bookmarkEnd w:id="3"/>
     </w:p>
     <w:p>
       <w:pPr>
@@ -163,54 +155,7 @@
         <w:pStyle w:val="pRight"/>
       </w:pPr>
       <w:r>
-        <w:rPr>
-          <w:rStyle w:val="fBold"/>
-        </w:rPr>
-        <w:t xml:space="preserve">dr Waldemar Suszyński</w:t>
-      </w:r>
-    </w:p>
-    <w:p>
-      <w:pPr>
-        <w:pStyle w:val="pRight"/>
-      </w:pPr>
-      <w:r>
-        <w:rPr>
-          <w:rStyle w:val="fRed"/>
-        </w:rPr>
-        <w:t xml:space="preserve">Imię, nazwisko, stopień/tytuł naukowy Promotora są w Mianowniku. Należy je odmienić!</w:t>
-      </w:r>
-    </w:p>
-    <w:p>
-      <w:pPr>
-        <w:pStyle w:val="pRight"/>
-      </w:pPr>
-      <w:r>
-        <w:rPr>
-          <w:rStyle w:val="fRed"/>
-        </w:rPr>
-        <w:t xml:space="preserve">Np. dr Jan Kowalski – pod kierunkiem dra (lub dr.) Jana Kowalskiego;</w:t>
-      </w:r>
-    </w:p>
-    <w:p>
-      <w:pPr>
-        <w:pStyle w:val="pRight"/>
-      </w:pPr>
-      <w:r>
-        <w:rPr>
-          <w:rStyle w:val="fRed"/>
-        </w:rPr>
-        <w:t xml:space="preserve">dr Janina Nowakowska – pod kierunkiem dr Janiny Nowakowskiej</w:t>
-      </w:r>
-    </w:p>
-    <w:p>
-      <w:pPr>
-        <w:pStyle w:val="pRight"/>
-      </w:pPr>
-      <w:r>
-        <w:rPr>
-          <w:rStyle w:val="fRedBold"/>
-        </w:rPr>
-        <w:t xml:space="preserve">Uwaga! Powyższy komentarz proszę usunąć przed skopiowaniem strony tytułowej do pracy.</w:t>
+        <w:t>dr. Waldemara Suszyńskiego</w:t>
       </w:r>
     </w:p>
     <w:p>
@@ -242,10 +187,6 @@
     </w:sectPr>
   </w:body>
 </w:document>
-</file>
-
-<file path=word/comments.xml><?xml version="1.0" encoding="utf-8"?>
-<w:comments xmlns:ve="http://schemas.openxmlformats.org/markup-compatibility/2006" xmlns:o="urn:schemas-microsoft-com:office:office" xmlns:r="http://schemas.openxmlformats.org/officeDocument/2006/relationships" xmlns:m="http://schemas.openxmlformats.org/officeDocument/2006/math" xmlns:v="urn:schemas-microsoft-com:vml" xmlns:wp="http://schemas.openxmlformats.org/drawingml/2006/wordprocessingDrawing" xmlns:w10="urn:schemas-microsoft-com:office:word" xmlns:w="http://schemas.openxmlformats.org/wordprocessingml/2006/main" xmlns:wne="http://schemas.microsoft.com/office/word/2006/wordml"/>
 </file>
 
 <file path=word/numbering.xml><?xml version="1.0" encoding="utf-8"?>
@@ -366,6 +307,19 @@
     <w:pPr>
       <w:spacing w:after="800"/>
     </w:pPr>
+  </w:style>
+  <w:style w:type="paragraph" w:customStyle="1" w:styleId="TitlePageHeading">
+    <w:name w:val="TitlePageHeading"/>
+    <w:basedOn w:val="Normal"/>
+    <w:pPr>
+      <w:spacing w:after="200"/>
+      <w:jc w:val="center"/>
+    </w:pPr>
+    <w:rPr>
+      <w:rFonts w:ascii="Times New Roman" w:hAnsi="Times New Roman"/>
+      <w:b/>
+      <w:sz w:val="36"/>
+    </w:rPr>
   </w:style>
 </w:styles>
 </file>

</xml_diff>